<commit_message>
Direcionamento e contador de tokens
</commit_message>
<xml_diff>
--- a/Projeto/Dicas IA/Fluxo de quando um PDF e subido.docx
+++ b/Projeto/Dicas IA/Fluxo de quando um PDF e subido.docx
@@ -1749,6 +1749,223 @@
       </w:tr>
     </w:tbl>
     <w:p/>
+    <w:p/>
+    <w:p/>
+    <w:p>
+      <w:r>
+        <w:rPr>
+          <w:rFonts w:ascii="Segoe UI Emoji" w:hAnsi="Segoe UI Emoji" w:cs="Segoe UI Emoji"/>
+        </w:rPr>
+        <w:t>🔁</w:t>
+      </w:r>
+      <w:r>
+        <w:t xml:space="preserve"> Atualização em vectorstore.py</w:t>
+      </w:r>
+    </w:p>
+    <w:p>
+      <w:pPr>
+        <w:rPr>
+          <w:lang w:val="pt-BR"/>
+        </w:rPr>
+      </w:pPr>
+      <w:r>
+        <w:rPr>
+          <w:lang w:val="pt-BR"/>
+        </w:rPr>
+        <w:t>Criar o</w:t>
+      </w:r>
+      <w:r>
+        <w:rPr>
+          <w:lang w:val="pt-BR"/>
+        </w:rPr>
+        <w:t xml:space="preserve"> fluxo na </w:t>
+      </w:r>
+      <w:proofErr w:type="spellStart"/>
+      <w:r>
+        <w:rPr>
+          <w:lang w:val="pt-BR"/>
+        </w:rPr>
+        <w:t>importacao</w:t>
+      </w:r>
+      <w:proofErr w:type="spellEnd"/>
+    </w:p>
+    <w:p>
+      <w:pPr>
+        <w:rPr>
+          <w:lang w:val="pt-BR"/>
+        </w:rPr>
+      </w:pPr>
+      <w:proofErr w:type="spellStart"/>
+      <w:r>
+        <w:rPr>
+          <w:lang w:val="pt-BR"/>
+        </w:rPr>
+        <w:t>if</w:t>
+      </w:r>
+      <w:proofErr w:type="spellEnd"/>
+      <w:r>
+        <w:rPr>
+          <w:lang w:val="pt-BR"/>
+        </w:rPr>
+        <w:t xml:space="preserve"> </w:t>
+      </w:r>
+      <w:proofErr w:type="spellStart"/>
+      <w:r>
+        <w:rPr>
+          <w:lang w:val="pt-BR"/>
+        </w:rPr>
+        <w:t>ext</w:t>
+      </w:r>
+      <w:proofErr w:type="spellEnd"/>
+      <w:r>
+        <w:rPr>
+          <w:lang w:val="pt-BR"/>
+        </w:rPr>
+        <w:t xml:space="preserve"> == ".</w:t>
+      </w:r>
+      <w:proofErr w:type="spellStart"/>
+      <w:r>
+        <w:rPr>
+          <w:lang w:val="pt-BR"/>
+        </w:rPr>
+        <w:t>pdf</w:t>
+      </w:r>
+      <w:proofErr w:type="spellEnd"/>
+      <w:r>
+        <w:rPr>
+          <w:lang w:val="pt-BR"/>
+        </w:rPr>
+        <w:t>":</w:t>
+      </w:r>
+    </w:p>
+    <w:p>
+      <w:pPr>
+        <w:rPr>
+          <w:lang w:val="pt-BR"/>
+        </w:rPr>
+      </w:pPr>
+      <w:r>
+        <w:rPr>
+          <w:lang w:val="pt-BR"/>
+        </w:rPr>
+        <w:t xml:space="preserve">    </w:t>
+      </w:r>
+      <w:proofErr w:type="spellStart"/>
+      <w:r>
+        <w:rPr>
+          <w:lang w:val="pt-BR"/>
+        </w:rPr>
+        <w:t>if</w:t>
+      </w:r>
+      <w:proofErr w:type="spellEnd"/>
+      <w:r>
+        <w:rPr>
+          <w:lang w:val="pt-BR"/>
+        </w:rPr>
+        <w:t xml:space="preserve"> "anexo-iii-programas-finalisticos.pdf" in </w:t>
+      </w:r>
+      <w:proofErr w:type="spellStart"/>
+      <w:proofErr w:type="gramStart"/>
+      <w:r>
+        <w:rPr>
+          <w:lang w:val="pt-BR"/>
+        </w:rPr>
+        <w:t>file.lower</w:t>
+      </w:r>
+      <w:proofErr w:type="spellEnd"/>
+      <w:proofErr w:type="gramEnd"/>
+      <w:r>
+        <w:rPr>
+          <w:lang w:val="pt-BR"/>
+        </w:rPr>
+        <w:t>():</w:t>
+      </w:r>
+    </w:p>
+    <w:p>
+      <w:pPr>
+        <w:rPr>
+          <w:lang w:val="pt-BR"/>
+        </w:rPr>
+      </w:pPr>
+      <w:r>
+        <w:rPr>
+          <w:lang w:val="pt-BR"/>
+        </w:rPr>
+        <w:lastRenderedPageBreak/>
+        <w:t xml:space="preserve">        </w:t>
+      </w:r>
+      <w:proofErr w:type="spellStart"/>
+      <w:r>
+        <w:rPr>
+          <w:lang w:val="pt-BR"/>
+        </w:rPr>
+        <w:t>log_to_</w:t>
+      </w:r>
+      <w:proofErr w:type="gramStart"/>
+      <w:r>
+        <w:rPr>
+          <w:lang w:val="pt-BR"/>
+        </w:rPr>
+        <w:t>streamlit</w:t>
+      </w:r>
+      <w:proofErr w:type="spellEnd"/>
+      <w:r>
+        <w:rPr>
+          <w:lang w:val="pt-BR"/>
+        </w:rPr>
+        <w:t>(</w:t>
+      </w:r>
+      <w:proofErr w:type="gramEnd"/>
+      <w:r>
+        <w:rPr>
+          <w:lang w:val="pt-BR"/>
+        </w:rPr>
+        <w:t>"</w:t>
+      </w:r>
+      <w:r>
+        <w:rPr>
+          <w:rFonts w:ascii="Segoe UI Emoji" w:hAnsi="Segoe UI Emoji" w:cs="Segoe UI Emoji"/>
+        </w:rPr>
+        <w:t>📚</w:t>
+      </w:r>
+      <w:r>
+        <w:rPr>
+          <w:lang w:val="pt-BR"/>
+        </w:rPr>
+        <w:t xml:space="preserve"> Usando parser estruturado do PPA...")</w:t>
+      </w:r>
+    </w:p>
+    <w:p>
+      <w:r>
+        <w:rPr>
+          <w:lang w:val="pt-BR"/>
+        </w:rPr>
+        <w:t xml:space="preserve">        </w:t>
+      </w:r>
+      <w:r>
+        <w:t>ppa_chunks = extrair_chunks_ppa(file)</w:t>
+      </w:r>
+    </w:p>
+    <w:p>
+      <w:r>
+        <w:t xml:space="preserve">        docs.extend(ppa_chunks)</w:t>
+      </w:r>
+    </w:p>
+    <w:p>
+      <w:r>
+        <w:t xml:space="preserve">    else:</w:t>
+      </w:r>
+    </w:p>
+    <w:p>
+      <w:r>
+        <w:t xml:space="preserve">        loader = PyPDFLoader(file)</w:t>
+      </w:r>
+    </w:p>
+    <w:p>
+      <w:r>
+        <w:t xml:space="preserve">        docs.extend(loader.load())</w:t>
+      </w:r>
+    </w:p>
     <w:sectPr>
       <w:pgSz w:w="11906" w:h="16838"/>
       <w:pgMar w:top="1417" w:right="1701" w:bottom="1417" w:left="1701" w:header="708" w:footer="708" w:gutter="0"/>

</xml_diff>

<commit_message>
Conversores e reranker ajustados
</commit_message>
<xml_diff>
--- a/Projeto/Dicas IA/Fluxo de quando um PDF e subido.docx
+++ b/Projeto/Dicas IA/Fluxo de quando um PDF e subido.docx
@@ -211,7 +211,7 @@
           <w:lang w:val="pt-BR"/>
         </w:rPr>
         <w:pict w14:anchorId="75194D26">
-          <v:rect id="_x0000_i1055" style="width:0;height:1.5pt" o:hralign="center" o:hrstd="t" o:hr="t" fillcolor="#a0a0a0" stroked="f"/>
+          <v:rect id="_x0000_i1025" style="width:0;height:1.5pt" o:hralign="center" o:hrstd="t" o:hr="t" fillcolor="#a0a0a0" stroked="f"/>
         </w:pict>
       </w:r>
     </w:p>
@@ -373,7 +373,7 @@
           <w:lang w:val="pt-BR"/>
         </w:rPr>
         <w:pict w14:anchorId="66B19D5E">
-          <v:rect id="_x0000_i1056" style="width:0;height:1.5pt" o:hralign="center" o:hrstd="t" o:hr="t" fillcolor="#a0a0a0" stroked="f"/>
+          <v:rect id="_x0000_i1026" style="width:0;height:1.5pt" o:hralign="center" o:hrstd="t" o:hr="t" fillcolor="#a0a0a0" stroked="f"/>
         </w:pict>
       </w:r>
     </w:p>
@@ -679,7 +679,7 @@
           <w:lang w:val="pt-BR"/>
         </w:rPr>
         <w:pict w14:anchorId="46EF1503">
-          <v:rect id="_x0000_i1057" style="width:0;height:1.5pt" o:hralign="center" o:hrstd="t" o:hr="t" fillcolor="#a0a0a0" stroked="f"/>
+          <v:rect id="_x0000_i1027" style="width:0;height:1.5pt" o:hralign="center" o:hrstd="t" o:hr="t" fillcolor="#a0a0a0" stroked="f"/>
         </w:pict>
       </w:r>
     </w:p>
@@ -901,7 +901,7 @@
           <w:lang w:val="pt-BR"/>
         </w:rPr>
         <w:pict w14:anchorId="5D05E336">
-          <v:rect id="_x0000_i1058" style="width:0;height:1.5pt" o:hralign="center" o:hrstd="t" o:hr="t" fillcolor="#a0a0a0" stroked="f"/>
+          <v:rect id="_x0000_i1028" style="width:0;height:1.5pt" o:hralign="center" o:hrstd="t" o:hr="t" fillcolor="#a0a0a0" stroked="f"/>
         </w:pict>
       </w:r>
     </w:p>
@@ -1029,16 +1029,7 @@
           <w:bCs/>
           <w:lang w:val="pt-BR"/>
         </w:rPr>
-        <w:t xml:space="preserve">entender que "o programa" se refere ao último </w:t>
-      </w:r>
-      <w:proofErr w:type="gramStart"/>
-      <w:r>
-        <w:rPr>
-          <w:b/>
-          <w:bCs/>
-          <w:lang w:val="pt-BR"/>
-        </w:rPr>
-        <w:t>citado</w:t>
+        <w:t>entender que "o programa" se refere ao último citado</w:t>
       </w:r>
       <w:r>
         <w:rPr>
@@ -1046,7 +1037,6 @@
         </w:rPr>
         <w:t>, etc.</w:t>
       </w:r>
-      <w:proofErr w:type="gramEnd"/>
     </w:p>
     <w:p>
       <w:pPr>
@@ -1059,7 +1049,7 @@
           <w:lang w:val="pt-BR"/>
         </w:rPr>
         <w:pict w14:anchorId="45EA87A0">
-          <v:rect id="_x0000_i1059" style="width:0;height:1.5pt" o:hralign="center" o:hrstd="t" o:hr="t" fillcolor="#a0a0a0" stroked="f"/>
+          <v:rect id="_x0000_i1029" style="width:0;height:1.5pt" o:hralign="center" o:hrstd="t" o:hr="t" fillcolor="#a0a0a0" stroked="f"/>
         </w:pict>
       </w:r>
     </w:p>
@@ -1865,7 +1855,6 @@
         <w:t xml:space="preserve"> "anexo-iii-programas-finalisticos.pdf" in </w:t>
       </w:r>
       <w:proofErr w:type="spellStart"/>
-      <w:proofErr w:type="gramStart"/>
       <w:r>
         <w:rPr>
           <w:lang w:val="pt-BR"/>
@@ -1873,7 +1862,6 @@
         <w:t>file.lower</w:t>
       </w:r>
       <w:proofErr w:type="spellEnd"/>
-      <w:proofErr w:type="gramEnd"/>
       <w:r>
         <w:rPr>
           <w:lang w:val="pt-BR"/>
@@ -1899,71 +1887,1384 @@
         <w:rPr>
           <w:lang w:val="pt-BR"/>
         </w:rPr>
-        <w:t>log_to_</w:t>
-      </w:r>
-      <w:proofErr w:type="gramStart"/>
-      <w:r>
-        <w:rPr>
-          <w:lang w:val="pt-BR"/>
-        </w:rPr>
-        <w:t>streamlit</w:t>
+        <w:t>log_to_streamlit</w:t>
       </w:r>
       <w:proofErr w:type="spellEnd"/>
       <w:r>
         <w:rPr>
           <w:lang w:val="pt-BR"/>
         </w:rPr>
+        <w:t>("</w:t>
+      </w:r>
+      <w:r>
+        <w:rPr>
+          <w:rFonts w:ascii="Segoe UI Emoji" w:hAnsi="Segoe UI Emoji" w:cs="Segoe UI Emoji"/>
+        </w:rPr>
+        <w:t>📚</w:t>
+      </w:r>
+      <w:r>
+        <w:rPr>
+          <w:lang w:val="pt-BR"/>
+        </w:rPr>
+        <w:t xml:space="preserve"> Usando parser estruturado do PPA...")</w:t>
+      </w:r>
+    </w:p>
+    <w:p>
+      <w:r>
+        <w:rPr>
+          <w:lang w:val="pt-BR"/>
+        </w:rPr>
+        <w:t xml:space="preserve">        </w:t>
+      </w:r>
+      <w:r>
+        <w:t>ppa_chunks = extrair_chunks_ppa(file)</w:t>
+      </w:r>
+    </w:p>
+    <w:p>
+      <w:r>
+        <w:t xml:space="preserve">        docs.extend(ppa_chunks)</w:t>
+      </w:r>
+    </w:p>
+    <w:p>
+      <w:r>
+        <w:t xml:space="preserve">    else:</w:t>
+      </w:r>
+    </w:p>
+    <w:p>
+      <w:pPr>
+        <w:rPr>
+          <w:lang w:val="pt-BR"/>
+        </w:rPr>
+      </w:pPr>
+      <w:r>
+        <w:t xml:space="preserve">        </w:t>
+      </w:r>
+      <w:proofErr w:type="spellStart"/>
+      <w:r>
+        <w:rPr>
+          <w:lang w:val="pt-BR"/>
+        </w:rPr>
+        <w:t>loader</w:t>
+      </w:r>
+      <w:proofErr w:type="spellEnd"/>
+      <w:r>
+        <w:rPr>
+          <w:lang w:val="pt-BR"/>
+        </w:rPr>
+        <w:t xml:space="preserve"> = </w:t>
+      </w:r>
+      <w:proofErr w:type="spellStart"/>
+      <w:r>
+        <w:rPr>
+          <w:lang w:val="pt-BR"/>
+        </w:rPr>
+        <w:t>PyPDFLoader</w:t>
+      </w:r>
+      <w:proofErr w:type="spellEnd"/>
+      <w:r>
+        <w:rPr>
+          <w:lang w:val="pt-BR"/>
+        </w:rPr>
+        <w:t>(file)</w:t>
+      </w:r>
+    </w:p>
+    <w:p>
+      <w:pPr>
+        <w:rPr>
+          <w:lang w:val="pt-BR"/>
+        </w:rPr>
+      </w:pPr>
+      <w:r>
+        <w:rPr>
+          <w:lang w:val="pt-BR"/>
+        </w:rPr>
+        <w:t xml:space="preserve">        </w:t>
+      </w:r>
+      <w:proofErr w:type="spellStart"/>
+      <w:r>
+        <w:rPr>
+          <w:lang w:val="pt-BR"/>
+        </w:rPr>
+        <w:t>docs.extend</w:t>
+      </w:r>
+      <w:proofErr w:type="spellEnd"/>
+      <w:r>
+        <w:rPr>
+          <w:lang w:val="pt-BR"/>
+        </w:rPr>
         <w:t>(</w:t>
       </w:r>
-      <w:proofErr w:type="gramEnd"/>
-      <w:r>
-        <w:rPr>
-          <w:lang w:val="pt-BR"/>
-        </w:rPr>
-        <w:t>"</w:t>
-      </w:r>
+      <w:proofErr w:type="spellStart"/>
+      <w:r>
+        <w:rPr>
+          <w:lang w:val="pt-BR"/>
+        </w:rPr>
+        <w:t>loader.load</w:t>
+      </w:r>
+      <w:proofErr w:type="spellEnd"/>
+      <w:r>
+        <w:rPr>
+          <w:lang w:val="pt-BR"/>
+        </w:rPr>
+        <w:t>())</w:t>
+      </w:r>
+    </w:p>
+    <w:p>
+      <w:pPr>
+        <w:rPr>
+          <w:lang w:val="pt-BR"/>
+        </w:rPr>
+      </w:pPr>
+    </w:p>
+    <w:p>
+      <w:pPr>
+        <w:rPr>
+          <w:lang w:val="pt-BR"/>
+        </w:rPr>
+      </w:pPr>
+    </w:p>
+    <w:p>
+      <w:pPr>
+        <w:rPr>
+          <w:lang w:val="pt-BR"/>
+        </w:rPr>
+      </w:pPr>
+    </w:p>
+    <w:p>
+      <w:pPr>
+        <w:rPr>
+          <w:lang w:val="pt-BR"/>
+        </w:rPr>
+      </w:pPr>
+      <w:r>
+        <w:rPr>
+          <w:lang w:val="pt-BR"/>
+        </w:rPr>
+        <w:t>Ótima pergunta.</w:t>
+      </w:r>
+    </w:p>
+    <w:p>
+      <w:pPr>
+        <w:rPr>
+          <w:lang w:val="pt-BR"/>
+        </w:rPr>
+      </w:pPr>
+      <w:r>
+        <w:rPr>
+          <w:lang w:val="pt-BR"/>
+        </w:rPr>
+        <w:t xml:space="preserve">A informação </w:t>
+      </w:r>
+      <w:proofErr w:type="spellStart"/>
+      <w:r>
+        <w:rPr>
+          <w:lang w:val="pt-BR"/>
+        </w:rPr>
+        <w:t>Embedding</w:t>
+      </w:r>
+      <w:proofErr w:type="spellEnd"/>
+      <w:r>
+        <w:rPr>
+          <w:lang w:val="pt-BR"/>
+        </w:rPr>
+        <w:t xml:space="preserve"> </w:t>
+      </w:r>
+      <w:proofErr w:type="spellStart"/>
+      <w:r>
+        <w:rPr>
+          <w:lang w:val="pt-BR"/>
+        </w:rPr>
+        <w:t>length</w:t>
+      </w:r>
+      <w:proofErr w:type="spellEnd"/>
+      <w:r>
+        <w:rPr>
+          <w:lang w:val="pt-BR"/>
+        </w:rPr>
+        <w:t xml:space="preserve">: 3072 tokens refere-se ao </w:t>
+      </w:r>
+      <w:r>
+        <w:rPr>
+          <w:b/>
+          <w:bCs/>
+          <w:lang w:val="pt-BR"/>
+        </w:rPr>
+        <w:t xml:space="preserve">tamanho do vetor de </w:t>
+      </w:r>
+      <w:proofErr w:type="spellStart"/>
+      <w:r>
+        <w:rPr>
+          <w:b/>
+          <w:bCs/>
+          <w:lang w:val="pt-BR"/>
+        </w:rPr>
+        <w:t>embedding</w:t>
+      </w:r>
+      <w:proofErr w:type="spellEnd"/>
+      <w:r>
+        <w:rPr>
+          <w:b/>
+          <w:bCs/>
+          <w:lang w:val="pt-BR"/>
+        </w:rPr>
+        <w:t xml:space="preserve"> que a LLM gera para cada token de entrada</w:t>
+      </w:r>
+      <w:r>
+        <w:rPr>
+          <w:lang w:val="pt-BR"/>
+        </w:rPr>
+        <w:t xml:space="preserve"> — ou mais tecnicamente, ao </w:t>
+      </w:r>
+      <w:r>
+        <w:rPr>
+          <w:b/>
+          <w:bCs/>
+          <w:lang w:val="pt-BR"/>
+        </w:rPr>
+        <w:t>número de dimensões do vetor</w:t>
+      </w:r>
+      <w:r>
+        <w:rPr>
+          <w:lang w:val="pt-BR"/>
+        </w:rPr>
+        <w:t xml:space="preserve"> que representa cada token internamente no modelo.</w:t>
+      </w:r>
+    </w:p>
+    <w:p>
+      <w:pPr>
+        <w:rPr>
+          <w:lang w:val="pt-BR"/>
+        </w:rPr>
+      </w:pPr>
+      <w:r>
+        <w:rPr>
+          <w:lang w:val="pt-BR"/>
+        </w:rPr>
+        <w:pict w14:anchorId="3B95979A">
+          <v:rect id="_x0000_i1054" style="width:0;height:1.5pt" o:hralign="center" o:hrstd="t" o:hr="t" fillcolor="#a0a0a0" stroked="f"/>
+        </w:pict>
+      </w:r>
+    </w:p>
+    <w:p>
+      <w:pPr>
+        <w:rPr>
+          <w:b/>
+          <w:bCs/>
+          <w:lang w:val="pt-BR"/>
+        </w:rPr>
+      </w:pPr>
       <w:r>
         <w:rPr>
           <w:rFonts w:ascii="Segoe UI Emoji" w:hAnsi="Segoe UI Emoji" w:cs="Segoe UI Emoji"/>
-        </w:rPr>
-        <w:t>📚</w:t>
-      </w:r>
-      <w:r>
-        <w:rPr>
-          <w:lang w:val="pt-BR"/>
-        </w:rPr>
-        <w:t xml:space="preserve"> Usando parser estruturado do PPA...")</w:t>
-      </w:r>
-    </w:p>
-    <w:p>
-      <w:r>
-        <w:rPr>
-          <w:lang w:val="pt-BR"/>
-        </w:rPr>
-        <w:t xml:space="preserve">        </w:t>
-      </w:r>
-      <w:r>
-        <w:t>ppa_chunks = extrair_chunks_ppa(file)</w:t>
-      </w:r>
-    </w:p>
-    <w:p>
-      <w:r>
-        <w:t xml:space="preserve">        docs.extend(ppa_chunks)</w:t>
-      </w:r>
-    </w:p>
-    <w:p>
-      <w:r>
-        <w:t xml:space="preserve">    else:</w:t>
-      </w:r>
-    </w:p>
-    <w:p>
-      <w:r>
-        <w:t xml:space="preserve">        loader = PyPDFLoader(file)</w:t>
-      </w:r>
-    </w:p>
-    <w:p>
-      <w:r>
-        <w:t xml:space="preserve">        docs.extend(loader.load())</w:t>
+          <w:b/>
+          <w:bCs/>
+          <w:lang w:val="pt-BR"/>
+        </w:rPr>
+        <w:t>📘</w:t>
+      </w:r>
+      <w:r>
+        <w:rPr>
+          <w:b/>
+          <w:bCs/>
+          <w:lang w:val="pt-BR"/>
+        </w:rPr>
+        <w:t xml:space="preserve"> O que significa "</w:t>
+      </w:r>
+      <w:proofErr w:type="spellStart"/>
+      <w:r>
+        <w:rPr>
+          <w:b/>
+          <w:bCs/>
+          <w:lang w:val="pt-BR"/>
+        </w:rPr>
+        <w:t>Embedding</w:t>
+      </w:r>
+      <w:proofErr w:type="spellEnd"/>
+      <w:r>
+        <w:rPr>
+          <w:b/>
+          <w:bCs/>
+          <w:lang w:val="pt-BR"/>
+        </w:rPr>
+        <w:t xml:space="preserve"> </w:t>
+      </w:r>
+      <w:proofErr w:type="spellStart"/>
+      <w:r>
+        <w:rPr>
+          <w:b/>
+          <w:bCs/>
+          <w:lang w:val="pt-BR"/>
+        </w:rPr>
+        <w:t>length</w:t>
+      </w:r>
+      <w:proofErr w:type="spellEnd"/>
+      <w:r>
+        <w:rPr>
+          <w:b/>
+          <w:bCs/>
+          <w:lang w:val="pt-BR"/>
+        </w:rPr>
+        <w:t xml:space="preserve"> = 3072"?</w:t>
+      </w:r>
+    </w:p>
+    <w:p>
+      <w:pPr>
+        <w:numPr>
+          <w:ilvl w:val="0"/>
+          <w:numId w:val="7"/>
+        </w:numPr>
+        <w:rPr>
+          <w:lang w:val="pt-BR"/>
+        </w:rPr>
+      </w:pPr>
+      <w:r>
+        <w:rPr>
+          <w:lang w:val="pt-BR"/>
+        </w:rPr>
+        <w:t xml:space="preserve">Para cada token processado pela LLM, o modelo converte esse token em um vetor numérico de tamanho </w:t>
+      </w:r>
+      <w:r>
+        <w:rPr>
+          <w:b/>
+          <w:bCs/>
+          <w:lang w:val="pt-BR"/>
+        </w:rPr>
+        <w:t>3072 dimensões</w:t>
+      </w:r>
+      <w:r>
+        <w:rPr>
+          <w:lang w:val="pt-BR"/>
+        </w:rPr>
+        <w:t>.</w:t>
+      </w:r>
+    </w:p>
+    <w:p>
+      <w:pPr>
+        <w:numPr>
+          <w:ilvl w:val="0"/>
+          <w:numId w:val="7"/>
+        </w:numPr>
+        <w:rPr>
+          <w:lang w:val="pt-BR"/>
+        </w:rPr>
+      </w:pPr>
+      <w:r>
+        <w:rPr>
+          <w:lang w:val="pt-BR"/>
+        </w:rPr>
+        <w:t xml:space="preserve">Esse vetor é chamado de </w:t>
+      </w:r>
+      <w:proofErr w:type="spellStart"/>
+      <w:r>
+        <w:rPr>
+          <w:b/>
+          <w:bCs/>
+          <w:lang w:val="pt-BR"/>
+        </w:rPr>
+        <w:t>embedding</w:t>
+      </w:r>
+      <w:proofErr w:type="spellEnd"/>
+      <w:r>
+        <w:rPr>
+          <w:lang w:val="pt-BR"/>
+        </w:rPr>
+        <w:t xml:space="preserve"> e representa o significado contextual do token.</w:t>
+      </w:r>
+    </w:p>
+    <w:p>
+      <w:pPr>
+        <w:numPr>
+          <w:ilvl w:val="0"/>
+          <w:numId w:val="7"/>
+        </w:numPr>
+        <w:rPr>
+          <w:lang w:val="pt-BR"/>
+        </w:rPr>
+      </w:pPr>
+      <w:r>
+        <w:rPr>
+          <w:lang w:val="pt-BR"/>
+        </w:rPr>
+        <w:t xml:space="preserve">Essa dimensão é </w:t>
+      </w:r>
+      <w:r>
+        <w:rPr>
+          <w:b/>
+          <w:bCs/>
+          <w:lang w:val="pt-BR"/>
+        </w:rPr>
+        <w:t>fixa</w:t>
+      </w:r>
+      <w:r>
+        <w:rPr>
+          <w:lang w:val="pt-BR"/>
+        </w:rPr>
+        <w:t xml:space="preserve"> para o modelo — no caso do </w:t>
+      </w:r>
+      <w:proofErr w:type="spellStart"/>
+      <w:r>
+        <w:rPr>
+          <w:lang w:val="pt-BR"/>
+        </w:rPr>
+        <w:t>LLaMA</w:t>
+      </w:r>
+      <w:proofErr w:type="spellEnd"/>
+      <w:r>
+        <w:rPr>
+          <w:lang w:val="pt-BR"/>
+        </w:rPr>
+        <w:t xml:space="preserve"> 3.2B, é 3072.</w:t>
+      </w:r>
+    </w:p>
+    <w:p>
+      <w:pPr>
+        <w:rPr>
+          <w:lang w:val="pt-BR"/>
+        </w:rPr>
+      </w:pPr>
+      <w:r>
+        <w:rPr>
+          <w:lang w:val="pt-BR"/>
+        </w:rPr>
+        <w:pict w14:anchorId="74E5BD64">
+          <v:rect id="_x0000_i1055" style="width:0;height:1.5pt" o:hralign="center" o:hrstd="t" o:hr="t" fillcolor="#a0a0a0" stroked="f"/>
+        </w:pict>
+      </w:r>
+    </w:p>
+    <w:p>
+      <w:pPr>
+        <w:rPr>
+          <w:b/>
+          <w:bCs/>
+          <w:lang w:val="pt-BR"/>
+        </w:rPr>
+      </w:pPr>
+      <w:r>
+        <w:rPr>
+          <w:rFonts w:ascii="Segoe UI Emoji" w:hAnsi="Segoe UI Emoji" w:cs="Segoe UI Emoji"/>
+          <w:b/>
+          <w:bCs/>
+          <w:lang w:val="pt-BR"/>
+        </w:rPr>
+        <w:t>🧠</w:t>
+      </w:r>
+      <w:r>
+        <w:rPr>
+          <w:b/>
+          <w:bCs/>
+          <w:lang w:val="pt-BR"/>
+        </w:rPr>
+        <w:t xml:space="preserve"> Para que isso pode ser útil pra você?</w:t>
+      </w:r>
+    </w:p>
+    <w:p>
+      <w:pPr>
+        <w:rPr>
+          <w:b/>
+          <w:bCs/>
+          <w:lang w:val="pt-BR"/>
+        </w:rPr>
+      </w:pPr>
+      <w:r>
+        <w:rPr>
+          <w:rFonts w:ascii="Segoe UI Emoji" w:hAnsi="Segoe UI Emoji" w:cs="Segoe UI Emoji"/>
+          <w:b/>
+          <w:bCs/>
+          <w:lang w:val="pt-BR"/>
+        </w:rPr>
+        <w:t>✅</w:t>
+      </w:r>
+      <w:r>
+        <w:rPr>
+          <w:b/>
+          <w:bCs/>
+          <w:lang w:val="pt-BR"/>
+        </w:rPr>
+        <w:t xml:space="preserve"> 1. Compatibilidade com camadas posteriores</w:t>
+      </w:r>
+    </w:p>
+    <w:p>
+      <w:pPr>
+        <w:rPr>
+          <w:lang w:val="pt-BR"/>
+        </w:rPr>
+      </w:pPr>
+      <w:r>
+        <w:rPr>
+          <w:lang w:val="pt-BR"/>
+        </w:rPr>
+        <w:t>Se você for:</w:t>
+      </w:r>
+    </w:p>
+    <w:p>
+      <w:pPr>
+        <w:numPr>
+          <w:ilvl w:val="0"/>
+          <w:numId w:val="8"/>
+        </w:numPr>
+        <w:rPr>
+          <w:lang w:val="pt-BR"/>
+        </w:rPr>
+      </w:pPr>
+      <w:r>
+        <w:rPr>
+          <w:lang w:val="pt-BR"/>
+        </w:rPr>
+        <w:t>Modificar ou integrar o modelo,</w:t>
+      </w:r>
+    </w:p>
+    <w:p>
+      <w:pPr>
+        <w:numPr>
+          <w:ilvl w:val="0"/>
+          <w:numId w:val="8"/>
+        </w:numPr>
+        <w:rPr>
+          <w:lang w:val="pt-BR"/>
+        </w:rPr>
+      </w:pPr>
+      <w:r>
+        <w:rPr>
+          <w:lang w:val="pt-BR"/>
+        </w:rPr>
+        <w:t xml:space="preserve">Usar </w:t>
+      </w:r>
+      <w:proofErr w:type="spellStart"/>
+      <w:r>
+        <w:rPr>
+          <w:lang w:val="pt-BR"/>
+        </w:rPr>
+        <w:t>embeddings</w:t>
+      </w:r>
+      <w:proofErr w:type="spellEnd"/>
+      <w:r>
+        <w:rPr>
+          <w:lang w:val="pt-BR"/>
+        </w:rPr>
+        <w:t xml:space="preserve"> intermediários (</w:t>
+      </w:r>
+      <w:proofErr w:type="spellStart"/>
+      <w:r>
+        <w:rPr>
+          <w:lang w:val="pt-BR"/>
+        </w:rPr>
+        <w:t>ex</w:t>
+      </w:r>
+      <w:proofErr w:type="spellEnd"/>
+      <w:r>
+        <w:rPr>
+          <w:lang w:val="pt-BR"/>
+        </w:rPr>
+        <w:t xml:space="preserve">: </w:t>
+      </w:r>
+      <w:proofErr w:type="spellStart"/>
+      <w:r>
+        <w:rPr>
+          <w:lang w:val="pt-BR"/>
+        </w:rPr>
+        <w:t>hidden_states</w:t>
+      </w:r>
+      <w:proofErr w:type="spellEnd"/>
+      <w:r>
+        <w:rPr>
+          <w:lang w:val="pt-BR"/>
+        </w:rPr>
+        <w:t>),</w:t>
+      </w:r>
+    </w:p>
+    <w:p>
+      <w:pPr>
+        <w:numPr>
+          <w:ilvl w:val="0"/>
+          <w:numId w:val="8"/>
+        </w:numPr>
+        <w:rPr>
+          <w:lang w:val="pt-BR"/>
+        </w:rPr>
+      </w:pPr>
+      <w:r>
+        <w:rPr>
+          <w:lang w:val="pt-BR"/>
+        </w:rPr>
+        <w:t>Rodar inferência com customizações (</w:t>
+      </w:r>
+      <w:proofErr w:type="spellStart"/>
+      <w:r>
+        <w:rPr>
+          <w:lang w:val="pt-BR"/>
+        </w:rPr>
+        <w:t>ex</w:t>
+      </w:r>
+      <w:proofErr w:type="spellEnd"/>
+      <w:r>
+        <w:rPr>
+          <w:lang w:val="pt-BR"/>
+        </w:rPr>
+        <w:t>: fine-</w:t>
+      </w:r>
+      <w:proofErr w:type="spellStart"/>
+      <w:r>
+        <w:rPr>
+          <w:lang w:val="pt-BR"/>
+        </w:rPr>
+        <w:t>tuning</w:t>
+      </w:r>
+      <w:proofErr w:type="spellEnd"/>
+      <w:r>
+        <w:rPr>
+          <w:lang w:val="pt-BR"/>
+        </w:rPr>
+        <w:t xml:space="preserve">, </w:t>
+      </w:r>
+      <w:proofErr w:type="spellStart"/>
+      <w:r>
+        <w:rPr>
+          <w:lang w:val="pt-BR"/>
+        </w:rPr>
+        <w:t>LoRA</w:t>
+      </w:r>
+      <w:proofErr w:type="spellEnd"/>
+      <w:r>
+        <w:rPr>
+          <w:lang w:val="pt-BR"/>
+        </w:rPr>
+        <w:t>),</w:t>
+      </w:r>
+    </w:p>
+    <w:p>
+      <w:pPr>
+        <w:rPr>
+          <w:lang w:val="pt-BR"/>
+        </w:rPr>
+      </w:pPr>
+      <w:r>
+        <w:rPr>
+          <w:lang w:val="pt-BR"/>
+        </w:rPr>
+        <w:t xml:space="preserve">então </w:t>
+      </w:r>
+      <w:r>
+        <w:rPr>
+          <w:b/>
+          <w:bCs/>
+          <w:lang w:val="pt-BR"/>
+        </w:rPr>
+        <w:t xml:space="preserve">saber o tamanho do </w:t>
+      </w:r>
+      <w:proofErr w:type="spellStart"/>
+      <w:r>
+        <w:rPr>
+          <w:b/>
+          <w:bCs/>
+          <w:lang w:val="pt-BR"/>
+        </w:rPr>
+        <w:t>embedding</w:t>
+      </w:r>
+      <w:proofErr w:type="spellEnd"/>
+      <w:r>
+        <w:rPr>
+          <w:b/>
+          <w:bCs/>
+          <w:lang w:val="pt-BR"/>
+        </w:rPr>
+        <w:t xml:space="preserve"> é fundamental</w:t>
+      </w:r>
+      <w:r>
+        <w:rPr>
+          <w:lang w:val="pt-BR"/>
+        </w:rPr>
+        <w:t xml:space="preserve"> para configurar corretamente suas camadas (</w:t>
+      </w:r>
+      <w:proofErr w:type="spellStart"/>
+      <w:r>
+        <w:rPr>
+          <w:lang w:val="pt-BR"/>
+        </w:rPr>
+        <w:t>ex</w:t>
+      </w:r>
+      <w:proofErr w:type="spellEnd"/>
+      <w:r>
+        <w:rPr>
+          <w:lang w:val="pt-BR"/>
+        </w:rPr>
+        <w:t>: atenção, projeção, etc.).</w:t>
+      </w:r>
+    </w:p>
+    <w:p>
+      <w:pPr>
+        <w:rPr>
+          <w:lang w:val="pt-BR"/>
+        </w:rPr>
+      </w:pPr>
+      <w:r>
+        <w:rPr>
+          <w:lang w:val="pt-BR"/>
+        </w:rPr>
+        <w:pict w14:anchorId="2C9FAC5A">
+          <v:rect id="_x0000_i1056" style="width:0;height:1.5pt" o:hralign="center" o:hrstd="t" o:hr="t" fillcolor="#a0a0a0" stroked="f"/>
+        </w:pict>
+      </w:r>
+    </w:p>
+    <w:p>
+      <w:pPr>
+        <w:rPr>
+          <w:b/>
+          <w:bCs/>
+          <w:lang w:val="pt-BR"/>
+        </w:rPr>
+      </w:pPr>
+      <w:r>
+        <w:rPr>
+          <w:rFonts w:ascii="Segoe UI Emoji" w:hAnsi="Segoe UI Emoji" w:cs="Segoe UI Emoji"/>
+          <w:b/>
+          <w:bCs/>
+          <w:lang w:val="pt-BR"/>
+        </w:rPr>
+        <w:t>✅</w:t>
+      </w:r>
+      <w:r>
+        <w:rPr>
+          <w:b/>
+          <w:bCs/>
+          <w:lang w:val="pt-BR"/>
+        </w:rPr>
+        <w:t xml:space="preserve"> 2. Usar </w:t>
+      </w:r>
+      <w:proofErr w:type="spellStart"/>
+      <w:r>
+        <w:rPr>
+          <w:b/>
+          <w:bCs/>
+          <w:lang w:val="pt-BR"/>
+        </w:rPr>
+        <w:t>embeddings</w:t>
+      </w:r>
+      <w:proofErr w:type="spellEnd"/>
+      <w:r>
+        <w:rPr>
+          <w:b/>
+          <w:bCs/>
+          <w:lang w:val="pt-BR"/>
+        </w:rPr>
+        <w:t xml:space="preserve"> da LLM como vetores semânticos</w:t>
+      </w:r>
+    </w:p>
+    <w:p>
+      <w:pPr>
+        <w:rPr>
+          <w:lang w:val="pt-BR"/>
+        </w:rPr>
+      </w:pPr>
+      <w:r>
+        <w:rPr>
+          <w:lang w:val="pt-BR"/>
+        </w:rPr>
+        <w:t xml:space="preserve">Se quiser extrair </w:t>
+      </w:r>
+      <w:proofErr w:type="spellStart"/>
+      <w:r>
+        <w:rPr>
+          <w:b/>
+          <w:bCs/>
+          <w:lang w:val="pt-BR"/>
+        </w:rPr>
+        <w:t>embeddings</w:t>
+      </w:r>
+      <w:proofErr w:type="spellEnd"/>
+      <w:r>
+        <w:rPr>
+          <w:b/>
+          <w:bCs/>
+          <w:lang w:val="pt-BR"/>
+        </w:rPr>
+        <w:t xml:space="preserve"> de sentenças</w:t>
+      </w:r>
+      <w:r>
+        <w:rPr>
+          <w:lang w:val="pt-BR"/>
+        </w:rPr>
+        <w:t xml:space="preserve"> diretamente da LLM (e.g., do penúltimo </w:t>
+      </w:r>
+      <w:proofErr w:type="spellStart"/>
+      <w:r>
+        <w:rPr>
+          <w:lang w:val="pt-BR"/>
+        </w:rPr>
+        <w:t>layer</w:t>
+      </w:r>
+      <w:proofErr w:type="spellEnd"/>
+      <w:r>
+        <w:rPr>
+          <w:lang w:val="pt-BR"/>
+        </w:rPr>
+        <w:t>), esse valor:</w:t>
+      </w:r>
+    </w:p>
+    <w:p>
+      <w:pPr>
+        <w:numPr>
+          <w:ilvl w:val="0"/>
+          <w:numId w:val="9"/>
+        </w:numPr>
+        <w:rPr>
+          <w:lang w:val="pt-BR"/>
+        </w:rPr>
+      </w:pPr>
+      <w:r>
+        <w:rPr>
+          <w:b/>
+          <w:bCs/>
+          <w:lang w:val="pt-BR"/>
+        </w:rPr>
+        <w:lastRenderedPageBreak/>
+        <w:t>Define o tamanho dos vetores que você vai armazenar em um FAISS ou outro banco vetorial.</w:t>
+      </w:r>
+    </w:p>
+    <w:p>
+      <w:pPr>
+        <w:numPr>
+          <w:ilvl w:val="0"/>
+          <w:numId w:val="9"/>
+        </w:numPr>
+        <w:rPr>
+          <w:lang w:val="pt-BR"/>
+        </w:rPr>
+      </w:pPr>
+      <w:r>
+        <w:rPr>
+          <w:lang w:val="pt-BR"/>
+        </w:rPr>
+        <w:t xml:space="preserve">Exemplo: ao gerar um </w:t>
+      </w:r>
+      <w:proofErr w:type="spellStart"/>
+      <w:r>
+        <w:rPr>
+          <w:lang w:val="pt-BR"/>
+        </w:rPr>
+        <w:t>embedding</w:t>
+      </w:r>
+      <w:proofErr w:type="spellEnd"/>
+      <w:r>
+        <w:rPr>
+          <w:lang w:val="pt-BR"/>
+        </w:rPr>
+        <w:t xml:space="preserve"> via </w:t>
+      </w:r>
+      <w:proofErr w:type="spellStart"/>
+      <w:r>
+        <w:rPr>
+          <w:lang w:val="pt-BR"/>
+        </w:rPr>
+        <w:t>transformers</w:t>
+      </w:r>
+      <w:proofErr w:type="spellEnd"/>
+      <w:r>
+        <w:rPr>
+          <w:lang w:val="pt-BR"/>
+        </w:rPr>
+        <w:t>, você pode obter uma matriz N x 3072, onde N é o número de tokens.</w:t>
+      </w:r>
+    </w:p>
+    <w:p>
+      <w:pPr>
+        <w:rPr>
+          <w:lang w:val="pt-BR"/>
+        </w:rPr>
+      </w:pPr>
+      <w:r>
+        <w:rPr>
+          <w:lang w:val="pt-BR"/>
+        </w:rPr>
+        <w:pict w14:anchorId="04A3B877">
+          <v:rect id="_x0000_i1057" style="width:0;height:1.5pt" o:hralign="center" o:hrstd="t" o:hr="t" fillcolor="#a0a0a0" stroked="f"/>
+        </w:pict>
+      </w:r>
+    </w:p>
+    <w:p>
+      <w:pPr>
+        <w:rPr>
+          <w:b/>
+          <w:bCs/>
+          <w:lang w:val="pt-BR"/>
+        </w:rPr>
+      </w:pPr>
+      <w:r>
+        <w:rPr>
+          <w:rFonts w:ascii="Segoe UI Emoji" w:hAnsi="Segoe UI Emoji" w:cs="Segoe UI Emoji"/>
+          <w:b/>
+          <w:bCs/>
+          <w:lang w:val="pt-BR"/>
+        </w:rPr>
+        <w:t>✅</w:t>
+      </w:r>
+      <w:r>
+        <w:rPr>
+          <w:b/>
+          <w:bCs/>
+          <w:lang w:val="pt-BR"/>
+        </w:rPr>
+        <w:t xml:space="preserve"> 3. Limitações de memória ou velocidade</w:t>
+      </w:r>
+    </w:p>
+    <w:p>
+      <w:pPr>
+        <w:numPr>
+          <w:ilvl w:val="0"/>
+          <w:numId w:val="10"/>
+        </w:numPr>
+        <w:rPr>
+          <w:lang w:val="pt-BR"/>
+        </w:rPr>
+      </w:pPr>
+      <w:r>
+        <w:rPr>
+          <w:b/>
+          <w:bCs/>
+          <w:lang w:val="pt-BR"/>
+        </w:rPr>
+        <w:t xml:space="preserve">Modelos com </w:t>
+      </w:r>
+      <w:proofErr w:type="spellStart"/>
+      <w:r>
+        <w:rPr>
+          <w:b/>
+          <w:bCs/>
+          <w:lang w:val="pt-BR"/>
+        </w:rPr>
+        <w:t>embedding</w:t>
+      </w:r>
+      <w:proofErr w:type="spellEnd"/>
+      <w:r>
+        <w:rPr>
+          <w:b/>
+          <w:bCs/>
+          <w:lang w:val="pt-BR"/>
+        </w:rPr>
+        <w:t xml:space="preserve"> maiores consomem mais memória e são mais lentos.</w:t>
+      </w:r>
+    </w:p>
+    <w:p>
+      <w:pPr>
+        <w:numPr>
+          <w:ilvl w:val="0"/>
+          <w:numId w:val="10"/>
+        </w:numPr>
+        <w:rPr>
+          <w:lang w:val="pt-BR"/>
+        </w:rPr>
+      </w:pPr>
+      <w:r>
+        <w:rPr>
+          <w:lang w:val="pt-BR"/>
+        </w:rPr>
+        <w:t xml:space="preserve">Um modelo com </w:t>
+      </w:r>
+      <w:proofErr w:type="spellStart"/>
+      <w:r>
+        <w:rPr>
+          <w:lang w:val="pt-BR"/>
+        </w:rPr>
+        <w:t>embedding_length</w:t>
+      </w:r>
+      <w:proofErr w:type="spellEnd"/>
+      <w:r>
+        <w:rPr>
+          <w:lang w:val="pt-BR"/>
+        </w:rPr>
+        <w:t xml:space="preserve"> = 3072 consome:</w:t>
+      </w:r>
+    </w:p>
+    <w:p>
+      <w:pPr>
+        <w:numPr>
+          <w:ilvl w:val="1"/>
+          <w:numId w:val="10"/>
+        </w:numPr>
+        <w:rPr>
+          <w:lang w:val="pt-BR"/>
+        </w:rPr>
+      </w:pPr>
+      <w:r>
+        <w:rPr>
+          <w:lang w:val="pt-BR"/>
+        </w:rPr>
+        <w:t>Mais memória que um modelo com 768 ou 1024,</w:t>
+      </w:r>
+    </w:p>
+    <w:p>
+      <w:pPr>
+        <w:numPr>
+          <w:ilvl w:val="1"/>
+          <w:numId w:val="10"/>
+        </w:numPr>
+        <w:rPr>
+          <w:lang w:val="pt-BR"/>
+        </w:rPr>
+      </w:pPr>
+      <w:r>
+        <w:rPr>
+          <w:lang w:val="pt-BR"/>
+        </w:rPr>
+        <w:t>Mas menos que um modelo com 4096 (como GPT-3).</w:t>
+      </w:r>
+    </w:p>
+    <w:p>
+      <w:pPr>
+        <w:rPr>
+          <w:lang w:val="pt-BR"/>
+        </w:rPr>
+      </w:pPr>
+    </w:p>
+    <w:tbl>
+      <w:tblPr>
+        <w:tblW w:w="0" w:type="auto"/>
+        <w:tblCellSpacing w:w="15" w:type="dxa"/>
+        <w:tblCellMar>
+          <w:top w:w="15" w:type="dxa"/>
+          <w:left w:w="15" w:type="dxa"/>
+          <w:bottom w:w="15" w:type="dxa"/>
+          <w:right w:w="15" w:type="dxa"/>
+        </w:tblCellMar>
+        <w:tblLook w:val="04A0" w:firstRow="1" w:lastRow="0" w:firstColumn="1" w:lastColumn="0" w:noHBand="0" w:noVBand="1"/>
+      </w:tblPr>
+      <w:tblGrid>
+        <w:gridCol w:w="1257"/>
+        <w:gridCol w:w="1733"/>
+      </w:tblGrid>
+      <w:tr>
+        <w:trPr>
+          <w:tblHeader/>
+          <w:tblCellSpacing w:w="15" w:type="dxa"/>
+        </w:trPr>
+        <w:tc>
+          <w:tcPr>
+            <w:tcW w:w="0" w:type="auto"/>
+            <w:vAlign w:val="center"/>
+            <w:hideMark/>
+          </w:tcPr>
+          <w:p>
+            <w:pPr>
+              <w:rPr>
+                <w:b/>
+                <w:bCs/>
+                <w:lang w:val="pt-BR"/>
+              </w:rPr>
+            </w:pPr>
+            <w:r>
+              <w:rPr>
+                <w:b/>
+                <w:bCs/>
+                <w:lang w:val="pt-BR"/>
+              </w:rPr>
+              <w:t>Modelo</w:t>
+            </w:r>
+          </w:p>
+        </w:tc>
+        <w:tc>
+          <w:tcPr>
+            <w:tcW w:w="0" w:type="auto"/>
+            <w:vAlign w:val="center"/>
+            <w:hideMark/>
+          </w:tcPr>
+          <w:p>
+            <w:pPr>
+              <w:rPr>
+                <w:b/>
+                <w:bCs/>
+                <w:lang w:val="pt-BR"/>
+              </w:rPr>
+            </w:pPr>
+            <w:proofErr w:type="spellStart"/>
+            <w:r>
+              <w:rPr>
+                <w:b/>
+                <w:bCs/>
+                <w:lang w:val="pt-BR"/>
+              </w:rPr>
+              <w:t>Embedding</w:t>
+            </w:r>
+            <w:proofErr w:type="spellEnd"/>
+            <w:r>
+              <w:rPr>
+                <w:b/>
+                <w:bCs/>
+                <w:lang w:val="pt-BR"/>
+              </w:rPr>
+              <w:t xml:space="preserve"> </w:t>
+            </w:r>
+            <w:proofErr w:type="spellStart"/>
+            <w:r>
+              <w:rPr>
+                <w:b/>
+                <w:bCs/>
+                <w:lang w:val="pt-BR"/>
+              </w:rPr>
+              <w:t>length</w:t>
+            </w:r>
+            <w:proofErr w:type="spellEnd"/>
+          </w:p>
+        </w:tc>
+      </w:tr>
+      <w:tr>
+        <w:trPr>
+          <w:tblCellSpacing w:w="15" w:type="dxa"/>
+        </w:trPr>
+        <w:tc>
+          <w:tcPr>
+            <w:tcW w:w="0" w:type="auto"/>
+            <w:vAlign w:val="center"/>
+            <w:hideMark/>
+          </w:tcPr>
+          <w:p>
+            <w:pPr>
+              <w:rPr>
+                <w:lang w:val="pt-BR"/>
+              </w:rPr>
+            </w:pPr>
+            <w:r>
+              <w:rPr>
+                <w:lang w:val="pt-BR"/>
+              </w:rPr>
+              <w:t>BERT-base</w:t>
+            </w:r>
+          </w:p>
+        </w:tc>
+        <w:tc>
+          <w:tcPr>
+            <w:tcW w:w="0" w:type="auto"/>
+            <w:vAlign w:val="center"/>
+            <w:hideMark/>
+          </w:tcPr>
+          <w:p>
+            <w:pPr>
+              <w:rPr>
+                <w:lang w:val="pt-BR"/>
+              </w:rPr>
+            </w:pPr>
+            <w:r>
+              <w:rPr>
+                <w:lang w:val="pt-BR"/>
+              </w:rPr>
+              <w:t>768</w:t>
+            </w:r>
+          </w:p>
+        </w:tc>
+      </w:tr>
+      <w:tr>
+        <w:trPr>
+          <w:tblCellSpacing w:w="15" w:type="dxa"/>
+        </w:trPr>
+        <w:tc>
+          <w:tcPr>
+            <w:tcW w:w="0" w:type="auto"/>
+            <w:vAlign w:val="center"/>
+            <w:hideMark/>
+          </w:tcPr>
+          <w:p>
+            <w:pPr>
+              <w:rPr>
+                <w:lang w:val="pt-BR"/>
+              </w:rPr>
+            </w:pPr>
+            <w:r>
+              <w:rPr>
+                <w:lang w:val="pt-BR"/>
+              </w:rPr>
+              <w:t>GPT-2</w:t>
+            </w:r>
+          </w:p>
+        </w:tc>
+        <w:tc>
+          <w:tcPr>
+            <w:tcW w:w="0" w:type="auto"/>
+            <w:vAlign w:val="center"/>
+            <w:hideMark/>
+          </w:tcPr>
+          <w:p>
+            <w:pPr>
+              <w:rPr>
+                <w:lang w:val="pt-BR"/>
+              </w:rPr>
+            </w:pPr>
+            <w:r>
+              <w:rPr>
+                <w:lang w:val="pt-BR"/>
+              </w:rPr>
+              <w:t>768</w:t>
+            </w:r>
+          </w:p>
+        </w:tc>
+      </w:tr>
+      <w:tr>
+        <w:trPr>
+          <w:tblCellSpacing w:w="15" w:type="dxa"/>
+        </w:trPr>
+        <w:tc>
+          <w:tcPr>
+            <w:tcW w:w="0" w:type="auto"/>
+            <w:vAlign w:val="center"/>
+            <w:hideMark/>
+          </w:tcPr>
+          <w:p>
+            <w:pPr>
+              <w:rPr>
+                <w:lang w:val="pt-BR"/>
+              </w:rPr>
+            </w:pPr>
+            <w:r>
+              <w:rPr>
+                <w:lang w:val="pt-BR"/>
+              </w:rPr>
+              <w:t>GPT-3 (175B)</w:t>
+            </w:r>
+          </w:p>
+        </w:tc>
+        <w:tc>
+          <w:tcPr>
+            <w:tcW w:w="0" w:type="auto"/>
+            <w:vAlign w:val="center"/>
+            <w:hideMark/>
+          </w:tcPr>
+          <w:p>
+            <w:pPr>
+              <w:rPr>
+                <w:lang w:val="pt-BR"/>
+              </w:rPr>
+            </w:pPr>
+            <w:r>
+              <w:rPr>
+                <w:lang w:val="pt-BR"/>
+              </w:rPr>
+              <w:t>12288</w:t>
+            </w:r>
+          </w:p>
+        </w:tc>
+      </w:tr>
+      <w:tr>
+        <w:trPr>
+          <w:tblCellSpacing w:w="15" w:type="dxa"/>
+        </w:trPr>
+        <w:tc>
+          <w:tcPr>
+            <w:tcW w:w="0" w:type="auto"/>
+            <w:vAlign w:val="center"/>
+            <w:hideMark/>
+          </w:tcPr>
+          <w:p>
+            <w:pPr>
+              <w:rPr>
+                <w:lang w:val="pt-BR"/>
+              </w:rPr>
+            </w:pPr>
+            <w:proofErr w:type="spellStart"/>
+            <w:r>
+              <w:rPr>
+                <w:lang w:val="pt-BR"/>
+              </w:rPr>
+              <w:t>LLaMA</w:t>
+            </w:r>
+            <w:proofErr w:type="spellEnd"/>
+            <w:r>
+              <w:rPr>
+                <w:lang w:val="pt-BR"/>
+              </w:rPr>
+              <w:t xml:space="preserve"> 2 (7B)</w:t>
+            </w:r>
+          </w:p>
+        </w:tc>
+        <w:tc>
+          <w:tcPr>
+            <w:tcW w:w="0" w:type="auto"/>
+            <w:vAlign w:val="center"/>
+            <w:hideMark/>
+          </w:tcPr>
+          <w:p>
+            <w:pPr>
+              <w:rPr>
+                <w:lang w:val="pt-BR"/>
+              </w:rPr>
+            </w:pPr>
+            <w:r>
+              <w:rPr>
+                <w:lang w:val="pt-BR"/>
+              </w:rPr>
+              <w:t>4096</w:t>
+            </w:r>
+          </w:p>
+        </w:tc>
+      </w:tr>
+      <w:tr>
+        <w:trPr>
+          <w:tblCellSpacing w:w="15" w:type="dxa"/>
+        </w:trPr>
+        <w:tc>
+          <w:tcPr>
+            <w:tcW w:w="0" w:type="auto"/>
+            <w:vAlign w:val="center"/>
+            <w:hideMark/>
+          </w:tcPr>
+          <w:p>
+            <w:pPr>
+              <w:rPr>
+                <w:lang w:val="pt-BR"/>
+              </w:rPr>
+            </w:pPr>
+            <w:proofErr w:type="spellStart"/>
+            <w:r>
+              <w:rPr>
+                <w:b/>
+                <w:bCs/>
+                <w:lang w:val="pt-BR"/>
+              </w:rPr>
+              <w:t>LLaMA</w:t>
+            </w:r>
+            <w:proofErr w:type="spellEnd"/>
+            <w:r>
+              <w:rPr>
+                <w:b/>
+                <w:bCs/>
+                <w:lang w:val="pt-BR"/>
+              </w:rPr>
+              <w:t xml:space="preserve"> 3.2B</w:t>
+            </w:r>
+          </w:p>
+        </w:tc>
+        <w:tc>
+          <w:tcPr>
+            <w:tcW w:w="0" w:type="auto"/>
+            <w:vAlign w:val="center"/>
+            <w:hideMark/>
+          </w:tcPr>
+          <w:p>
+            <w:pPr>
+              <w:rPr>
+                <w:lang w:val="pt-BR"/>
+              </w:rPr>
+            </w:pPr>
+            <w:r>
+              <w:rPr>
+                <w:b/>
+                <w:bCs/>
+                <w:lang w:val="pt-BR"/>
+              </w:rPr>
+              <w:t>3072</w:t>
+            </w:r>
+          </w:p>
+        </w:tc>
+      </w:tr>
+    </w:tbl>
+    <w:p>
+      <w:pPr>
+        <w:rPr>
+          <w:u w:val="single"/>
+          <w:lang w:val="pt-BR"/>
+        </w:rPr>
+      </w:pPr>
+      <w:r>
+        <w:rPr>
+          <w:lang w:val="pt-BR"/>
+        </w:rPr>
+        <w:t>https://ai.meta.com/blog/llama-3-2-connect-2024-vision-edge-mobile-devices/</w:t>
       </w:r>
     </w:p>
     <w:sectPr>
@@ -2575,6 +3876,304 @@
     </w:lvl>
   </w:abstractNum>
   <w:abstractNum w:abstractNumId="4" w15:restartNumberingAfterBreak="0">
+    <w:nsid w:val="540C1A68"/>
+    <w:multiLevelType w:val="multilevel"/>
+    <w:tmpl w:val="9A2E6D9E"/>
+    <w:lvl w:ilvl="0">
+      <w:start w:val="1"/>
+      <w:numFmt w:val="bullet"/>
+      <w:lvlText w:val=""/>
+      <w:lvlJc w:val="left"/>
+      <w:pPr>
+        <w:tabs>
+          <w:tab w:val="num" w:pos="720"/>
+        </w:tabs>
+        <w:ind w:left="720" w:hanging="360"/>
+      </w:pPr>
+      <w:rPr>
+        <w:rFonts w:ascii="Symbol" w:hAnsi="Symbol" w:hint="default"/>
+        <w:sz w:val="20"/>
+      </w:rPr>
+    </w:lvl>
+    <w:lvl w:ilvl="1" w:tentative="1">
+      <w:start w:val="1"/>
+      <w:numFmt w:val="bullet"/>
+      <w:lvlText w:val="o"/>
+      <w:lvlJc w:val="left"/>
+      <w:pPr>
+        <w:tabs>
+          <w:tab w:val="num" w:pos="1440"/>
+        </w:tabs>
+        <w:ind w:left="1440" w:hanging="360"/>
+      </w:pPr>
+      <w:rPr>
+        <w:rFonts w:ascii="Courier New" w:hAnsi="Courier New" w:hint="default"/>
+        <w:sz w:val="20"/>
+      </w:rPr>
+    </w:lvl>
+    <w:lvl w:ilvl="2" w:tentative="1">
+      <w:start w:val="1"/>
+      <w:numFmt w:val="bullet"/>
+      <w:lvlText w:val=""/>
+      <w:lvlJc w:val="left"/>
+      <w:pPr>
+        <w:tabs>
+          <w:tab w:val="num" w:pos="2160"/>
+        </w:tabs>
+        <w:ind w:left="2160" w:hanging="360"/>
+      </w:pPr>
+      <w:rPr>
+        <w:rFonts w:ascii="Wingdings" w:hAnsi="Wingdings" w:hint="default"/>
+        <w:sz w:val="20"/>
+      </w:rPr>
+    </w:lvl>
+    <w:lvl w:ilvl="3" w:tentative="1">
+      <w:start w:val="1"/>
+      <w:numFmt w:val="bullet"/>
+      <w:lvlText w:val=""/>
+      <w:lvlJc w:val="left"/>
+      <w:pPr>
+        <w:tabs>
+          <w:tab w:val="num" w:pos="2880"/>
+        </w:tabs>
+        <w:ind w:left="2880" w:hanging="360"/>
+      </w:pPr>
+      <w:rPr>
+        <w:rFonts w:ascii="Wingdings" w:hAnsi="Wingdings" w:hint="default"/>
+        <w:sz w:val="20"/>
+      </w:rPr>
+    </w:lvl>
+    <w:lvl w:ilvl="4" w:tentative="1">
+      <w:start w:val="1"/>
+      <w:numFmt w:val="bullet"/>
+      <w:lvlText w:val=""/>
+      <w:lvlJc w:val="left"/>
+      <w:pPr>
+        <w:tabs>
+          <w:tab w:val="num" w:pos="3600"/>
+        </w:tabs>
+        <w:ind w:left="3600" w:hanging="360"/>
+      </w:pPr>
+      <w:rPr>
+        <w:rFonts w:ascii="Wingdings" w:hAnsi="Wingdings" w:hint="default"/>
+        <w:sz w:val="20"/>
+      </w:rPr>
+    </w:lvl>
+    <w:lvl w:ilvl="5" w:tentative="1">
+      <w:start w:val="1"/>
+      <w:numFmt w:val="bullet"/>
+      <w:lvlText w:val=""/>
+      <w:lvlJc w:val="left"/>
+      <w:pPr>
+        <w:tabs>
+          <w:tab w:val="num" w:pos="4320"/>
+        </w:tabs>
+        <w:ind w:left="4320" w:hanging="360"/>
+      </w:pPr>
+      <w:rPr>
+        <w:rFonts w:ascii="Wingdings" w:hAnsi="Wingdings" w:hint="default"/>
+        <w:sz w:val="20"/>
+      </w:rPr>
+    </w:lvl>
+    <w:lvl w:ilvl="6" w:tentative="1">
+      <w:start w:val="1"/>
+      <w:numFmt w:val="bullet"/>
+      <w:lvlText w:val=""/>
+      <w:lvlJc w:val="left"/>
+      <w:pPr>
+        <w:tabs>
+          <w:tab w:val="num" w:pos="5040"/>
+        </w:tabs>
+        <w:ind w:left="5040" w:hanging="360"/>
+      </w:pPr>
+      <w:rPr>
+        <w:rFonts w:ascii="Wingdings" w:hAnsi="Wingdings" w:hint="default"/>
+        <w:sz w:val="20"/>
+      </w:rPr>
+    </w:lvl>
+    <w:lvl w:ilvl="7" w:tentative="1">
+      <w:start w:val="1"/>
+      <w:numFmt w:val="bullet"/>
+      <w:lvlText w:val=""/>
+      <w:lvlJc w:val="left"/>
+      <w:pPr>
+        <w:tabs>
+          <w:tab w:val="num" w:pos="5760"/>
+        </w:tabs>
+        <w:ind w:left="5760" w:hanging="360"/>
+      </w:pPr>
+      <w:rPr>
+        <w:rFonts w:ascii="Wingdings" w:hAnsi="Wingdings" w:hint="default"/>
+        <w:sz w:val="20"/>
+      </w:rPr>
+    </w:lvl>
+    <w:lvl w:ilvl="8" w:tentative="1">
+      <w:start w:val="1"/>
+      <w:numFmt w:val="bullet"/>
+      <w:lvlText w:val=""/>
+      <w:lvlJc w:val="left"/>
+      <w:pPr>
+        <w:tabs>
+          <w:tab w:val="num" w:pos="6480"/>
+        </w:tabs>
+        <w:ind w:left="6480" w:hanging="360"/>
+      </w:pPr>
+      <w:rPr>
+        <w:rFonts w:ascii="Wingdings" w:hAnsi="Wingdings" w:hint="default"/>
+        <w:sz w:val="20"/>
+      </w:rPr>
+    </w:lvl>
+  </w:abstractNum>
+  <w:abstractNum w:abstractNumId="5" w15:restartNumberingAfterBreak="0">
+    <w:nsid w:val="68F37893"/>
+    <w:multiLevelType w:val="multilevel"/>
+    <w:tmpl w:val="CC300C1C"/>
+    <w:lvl w:ilvl="0">
+      <w:start w:val="1"/>
+      <w:numFmt w:val="bullet"/>
+      <w:lvlText w:val=""/>
+      <w:lvlJc w:val="left"/>
+      <w:pPr>
+        <w:tabs>
+          <w:tab w:val="num" w:pos="720"/>
+        </w:tabs>
+        <w:ind w:left="720" w:hanging="360"/>
+      </w:pPr>
+      <w:rPr>
+        <w:rFonts w:ascii="Symbol" w:hAnsi="Symbol" w:hint="default"/>
+        <w:sz w:val="20"/>
+      </w:rPr>
+    </w:lvl>
+    <w:lvl w:ilvl="1" w:tentative="1">
+      <w:start w:val="1"/>
+      <w:numFmt w:val="bullet"/>
+      <w:lvlText w:val="o"/>
+      <w:lvlJc w:val="left"/>
+      <w:pPr>
+        <w:tabs>
+          <w:tab w:val="num" w:pos="1440"/>
+        </w:tabs>
+        <w:ind w:left="1440" w:hanging="360"/>
+      </w:pPr>
+      <w:rPr>
+        <w:rFonts w:ascii="Courier New" w:hAnsi="Courier New" w:hint="default"/>
+        <w:sz w:val="20"/>
+      </w:rPr>
+    </w:lvl>
+    <w:lvl w:ilvl="2" w:tentative="1">
+      <w:start w:val="1"/>
+      <w:numFmt w:val="bullet"/>
+      <w:lvlText w:val=""/>
+      <w:lvlJc w:val="left"/>
+      <w:pPr>
+        <w:tabs>
+          <w:tab w:val="num" w:pos="2160"/>
+        </w:tabs>
+        <w:ind w:left="2160" w:hanging="360"/>
+      </w:pPr>
+      <w:rPr>
+        <w:rFonts w:ascii="Wingdings" w:hAnsi="Wingdings" w:hint="default"/>
+        <w:sz w:val="20"/>
+      </w:rPr>
+    </w:lvl>
+    <w:lvl w:ilvl="3" w:tentative="1">
+      <w:start w:val="1"/>
+      <w:numFmt w:val="bullet"/>
+      <w:lvlText w:val=""/>
+      <w:lvlJc w:val="left"/>
+      <w:pPr>
+        <w:tabs>
+          <w:tab w:val="num" w:pos="2880"/>
+        </w:tabs>
+        <w:ind w:left="2880" w:hanging="360"/>
+      </w:pPr>
+      <w:rPr>
+        <w:rFonts w:ascii="Wingdings" w:hAnsi="Wingdings" w:hint="default"/>
+        <w:sz w:val="20"/>
+      </w:rPr>
+    </w:lvl>
+    <w:lvl w:ilvl="4" w:tentative="1">
+      <w:start w:val="1"/>
+      <w:numFmt w:val="bullet"/>
+      <w:lvlText w:val=""/>
+      <w:lvlJc w:val="left"/>
+      <w:pPr>
+        <w:tabs>
+          <w:tab w:val="num" w:pos="3600"/>
+        </w:tabs>
+        <w:ind w:left="3600" w:hanging="360"/>
+      </w:pPr>
+      <w:rPr>
+        <w:rFonts w:ascii="Wingdings" w:hAnsi="Wingdings" w:hint="default"/>
+        <w:sz w:val="20"/>
+      </w:rPr>
+    </w:lvl>
+    <w:lvl w:ilvl="5" w:tentative="1">
+      <w:start w:val="1"/>
+      <w:numFmt w:val="bullet"/>
+      <w:lvlText w:val=""/>
+      <w:lvlJc w:val="left"/>
+      <w:pPr>
+        <w:tabs>
+          <w:tab w:val="num" w:pos="4320"/>
+        </w:tabs>
+        <w:ind w:left="4320" w:hanging="360"/>
+      </w:pPr>
+      <w:rPr>
+        <w:rFonts w:ascii="Wingdings" w:hAnsi="Wingdings" w:hint="default"/>
+        <w:sz w:val="20"/>
+      </w:rPr>
+    </w:lvl>
+    <w:lvl w:ilvl="6" w:tentative="1">
+      <w:start w:val="1"/>
+      <w:numFmt w:val="bullet"/>
+      <w:lvlText w:val=""/>
+      <w:lvlJc w:val="left"/>
+      <w:pPr>
+        <w:tabs>
+          <w:tab w:val="num" w:pos="5040"/>
+        </w:tabs>
+        <w:ind w:left="5040" w:hanging="360"/>
+      </w:pPr>
+      <w:rPr>
+        <w:rFonts w:ascii="Wingdings" w:hAnsi="Wingdings" w:hint="default"/>
+        <w:sz w:val="20"/>
+      </w:rPr>
+    </w:lvl>
+    <w:lvl w:ilvl="7" w:tentative="1">
+      <w:start w:val="1"/>
+      <w:numFmt w:val="bullet"/>
+      <w:lvlText w:val=""/>
+      <w:lvlJc w:val="left"/>
+      <w:pPr>
+        <w:tabs>
+          <w:tab w:val="num" w:pos="5760"/>
+        </w:tabs>
+        <w:ind w:left="5760" w:hanging="360"/>
+      </w:pPr>
+      <w:rPr>
+        <w:rFonts w:ascii="Wingdings" w:hAnsi="Wingdings" w:hint="default"/>
+        <w:sz w:val="20"/>
+      </w:rPr>
+    </w:lvl>
+    <w:lvl w:ilvl="8" w:tentative="1">
+      <w:start w:val="1"/>
+      <w:numFmt w:val="bullet"/>
+      <w:lvlText w:val=""/>
+      <w:lvlJc w:val="left"/>
+      <w:pPr>
+        <w:tabs>
+          <w:tab w:val="num" w:pos="6480"/>
+        </w:tabs>
+        <w:ind w:left="6480" w:hanging="360"/>
+      </w:pPr>
+      <w:rPr>
+        <w:rFonts w:ascii="Wingdings" w:hAnsi="Wingdings" w:hint="default"/>
+        <w:sz w:val="20"/>
+      </w:rPr>
+    </w:lvl>
+  </w:abstractNum>
+  <w:abstractNum w:abstractNumId="6" w15:restartNumberingAfterBreak="0">
     <w:nsid w:val="6D9C391E"/>
     <w:multiLevelType w:val="multilevel"/>
     <w:tmpl w:val="DC30C5B4"/>
@@ -2723,7 +4322,7 @@
       </w:rPr>
     </w:lvl>
   </w:abstractNum>
-  <w:abstractNum w:abstractNumId="5" w15:restartNumberingAfterBreak="0">
+  <w:abstractNum w:abstractNumId="7" w15:restartNumberingAfterBreak="0">
     <w:nsid w:val="70716E65"/>
     <w:multiLevelType w:val="multilevel"/>
     <w:tmpl w:val="EFA0784A"/>
@@ -2744,6 +4343,304 @@
       </w:rPr>
     </w:lvl>
     <w:lvl w:ilvl="1">
+      <w:start w:val="1"/>
+      <w:numFmt w:val="bullet"/>
+      <w:lvlText w:val="o"/>
+      <w:lvlJc w:val="left"/>
+      <w:pPr>
+        <w:tabs>
+          <w:tab w:val="num" w:pos="1440"/>
+        </w:tabs>
+        <w:ind w:left="1440" w:hanging="360"/>
+      </w:pPr>
+      <w:rPr>
+        <w:rFonts w:ascii="Courier New" w:hAnsi="Courier New" w:hint="default"/>
+        <w:sz w:val="20"/>
+      </w:rPr>
+    </w:lvl>
+    <w:lvl w:ilvl="2" w:tentative="1">
+      <w:start w:val="1"/>
+      <w:numFmt w:val="bullet"/>
+      <w:lvlText w:val=""/>
+      <w:lvlJc w:val="left"/>
+      <w:pPr>
+        <w:tabs>
+          <w:tab w:val="num" w:pos="2160"/>
+        </w:tabs>
+        <w:ind w:left="2160" w:hanging="360"/>
+      </w:pPr>
+      <w:rPr>
+        <w:rFonts w:ascii="Wingdings" w:hAnsi="Wingdings" w:hint="default"/>
+        <w:sz w:val="20"/>
+      </w:rPr>
+    </w:lvl>
+    <w:lvl w:ilvl="3" w:tentative="1">
+      <w:start w:val="1"/>
+      <w:numFmt w:val="bullet"/>
+      <w:lvlText w:val=""/>
+      <w:lvlJc w:val="left"/>
+      <w:pPr>
+        <w:tabs>
+          <w:tab w:val="num" w:pos="2880"/>
+        </w:tabs>
+        <w:ind w:left="2880" w:hanging="360"/>
+      </w:pPr>
+      <w:rPr>
+        <w:rFonts w:ascii="Wingdings" w:hAnsi="Wingdings" w:hint="default"/>
+        <w:sz w:val="20"/>
+      </w:rPr>
+    </w:lvl>
+    <w:lvl w:ilvl="4" w:tentative="1">
+      <w:start w:val="1"/>
+      <w:numFmt w:val="bullet"/>
+      <w:lvlText w:val=""/>
+      <w:lvlJc w:val="left"/>
+      <w:pPr>
+        <w:tabs>
+          <w:tab w:val="num" w:pos="3600"/>
+        </w:tabs>
+        <w:ind w:left="3600" w:hanging="360"/>
+      </w:pPr>
+      <w:rPr>
+        <w:rFonts w:ascii="Wingdings" w:hAnsi="Wingdings" w:hint="default"/>
+        <w:sz w:val="20"/>
+      </w:rPr>
+    </w:lvl>
+    <w:lvl w:ilvl="5" w:tentative="1">
+      <w:start w:val="1"/>
+      <w:numFmt w:val="bullet"/>
+      <w:lvlText w:val=""/>
+      <w:lvlJc w:val="left"/>
+      <w:pPr>
+        <w:tabs>
+          <w:tab w:val="num" w:pos="4320"/>
+        </w:tabs>
+        <w:ind w:left="4320" w:hanging="360"/>
+      </w:pPr>
+      <w:rPr>
+        <w:rFonts w:ascii="Wingdings" w:hAnsi="Wingdings" w:hint="default"/>
+        <w:sz w:val="20"/>
+      </w:rPr>
+    </w:lvl>
+    <w:lvl w:ilvl="6" w:tentative="1">
+      <w:start w:val="1"/>
+      <w:numFmt w:val="bullet"/>
+      <w:lvlText w:val=""/>
+      <w:lvlJc w:val="left"/>
+      <w:pPr>
+        <w:tabs>
+          <w:tab w:val="num" w:pos="5040"/>
+        </w:tabs>
+        <w:ind w:left="5040" w:hanging="360"/>
+      </w:pPr>
+      <w:rPr>
+        <w:rFonts w:ascii="Wingdings" w:hAnsi="Wingdings" w:hint="default"/>
+        <w:sz w:val="20"/>
+      </w:rPr>
+    </w:lvl>
+    <w:lvl w:ilvl="7" w:tentative="1">
+      <w:start w:val="1"/>
+      <w:numFmt w:val="bullet"/>
+      <w:lvlText w:val=""/>
+      <w:lvlJc w:val="left"/>
+      <w:pPr>
+        <w:tabs>
+          <w:tab w:val="num" w:pos="5760"/>
+        </w:tabs>
+        <w:ind w:left="5760" w:hanging="360"/>
+      </w:pPr>
+      <w:rPr>
+        <w:rFonts w:ascii="Wingdings" w:hAnsi="Wingdings" w:hint="default"/>
+        <w:sz w:val="20"/>
+      </w:rPr>
+    </w:lvl>
+    <w:lvl w:ilvl="8" w:tentative="1">
+      <w:start w:val="1"/>
+      <w:numFmt w:val="bullet"/>
+      <w:lvlText w:val=""/>
+      <w:lvlJc w:val="left"/>
+      <w:pPr>
+        <w:tabs>
+          <w:tab w:val="num" w:pos="6480"/>
+        </w:tabs>
+        <w:ind w:left="6480" w:hanging="360"/>
+      </w:pPr>
+      <w:rPr>
+        <w:rFonts w:ascii="Wingdings" w:hAnsi="Wingdings" w:hint="default"/>
+        <w:sz w:val="20"/>
+      </w:rPr>
+    </w:lvl>
+  </w:abstractNum>
+  <w:abstractNum w:abstractNumId="8" w15:restartNumberingAfterBreak="0">
+    <w:nsid w:val="73DB77D4"/>
+    <w:multiLevelType w:val="multilevel"/>
+    <w:tmpl w:val="83967E5A"/>
+    <w:lvl w:ilvl="0">
+      <w:start w:val="1"/>
+      <w:numFmt w:val="bullet"/>
+      <w:lvlText w:val=""/>
+      <w:lvlJc w:val="left"/>
+      <w:pPr>
+        <w:tabs>
+          <w:tab w:val="num" w:pos="720"/>
+        </w:tabs>
+        <w:ind w:left="720" w:hanging="360"/>
+      </w:pPr>
+      <w:rPr>
+        <w:rFonts w:ascii="Symbol" w:hAnsi="Symbol" w:hint="default"/>
+        <w:sz w:val="20"/>
+      </w:rPr>
+    </w:lvl>
+    <w:lvl w:ilvl="1">
+      <w:start w:val="1"/>
+      <w:numFmt w:val="bullet"/>
+      <w:lvlText w:val="o"/>
+      <w:lvlJc w:val="left"/>
+      <w:pPr>
+        <w:tabs>
+          <w:tab w:val="num" w:pos="1440"/>
+        </w:tabs>
+        <w:ind w:left="1440" w:hanging="360"/>
+      </w:pPr>
+      <w:rPr>
+        <w:rFonts w:ascii="Courier New" w:hAnsi="Courier New" w:hint="default"/>
+        <w:sz w:val="20"/>
+      </w:rPr>
+    </w:lvl>
+    <w:lvl w:ilvl="2" w:tentative="1">
+      <w:start w:val="1"/>
+      <w:numFmt w:val="bullet"/>
+      <w:lvlText w:val=""/>
+      <w:lvlJc w:val="left"/>
+      <w:pPr>
+        <w:tabs>
+          <w:tab w:val="num" w:pos="2160"/>
+        </w:tabs>
+        <w:ind w:left="2160" w:hanging="360"/>
+      </w:pPr>
+      <w:rPr>
+        <w:rFonts w:ascii="Wingdings" w:hAnsi="Wingdings" w:hint="default"/>
+        <w:sz w:val="20"/>
+      </w:rPr>
+    </w:lvl>
+    <w:lvl w:ilvl="3" w:tentative="1">
+      <w:start w:val="1"/>
+      <w:numFmt w:val="bullet"/>
+      <w:lvlText w:val=""/>
+      <w:lvlJc w:val="left"/>
+      <w:pPr>
+        <w:tabs>
+          <w:tab w:val="num" w:pos="2880"/>
+        </w:tabs>
+        <w:ind w:left="2880" w:hanging="360"/>
+      </w:pPr>
+      <w:rPr>
+        <w:rFonts w:ascii="Wingdings" w:hAnsi="Wingdings" w:hint="default"/>
+        <w:sz w:val="20"/>
+      </w:rPr>
+    </w:lvl>
+    <w:lvl w:ilvl="4" w:tentative="1">
+      <w:start w:val="1"/>
+      <w:numFmt w:val="bullet"/>
+      <w:lvlText w:val=""/>
+      <w:lvlJc w:val="left"/>
+      <w:pPr>
+        <w:tabs>
+          <w:tab w:val="num" w:pos="3600"/>
+        </w:tabs>
+        <w:ind w:left="3600" w:hanging="360"/>
+      </w:pPr>
+      <w:rPr>
+        <w:rFonts w:ascii="Wingdings" w:hAnsi="Wingdings" w:hint="default"/>
+        <w:sz w:val="20"/>
+      </w:rPr>
+    </w:lvl>
+    <w:lvl w:ilvl="5" w:tentative="1">
+      <w:start w:val="1"/>
+      <w:numFmt w:val="bullet"/>
+      <w:lvlText w:val=""/>
+      <w:lvlJc w:val="left"/>
+      <w:pPr>
+        <w:tabs>
+          <w:tab w:val="num" w:pos="4320"/>
+        </w:tabs>
+        <w:ind w:left="4320" w:hanging="360"/>
+      </w:pPr>
+      <w:rPr>
+        <w:rFonts w:ascii="Wingdings" w:hAnsi="Wingdings" w:hint="default"/>
+        <w:sz w:val="20"/>
+      </w:rPr>
+    </w:lvl>
+    <w:lvl w:ilvl="6" w:tentative="1">
+      <w:start w:val="1"/>
+      <w:numFmt w:val="bullet"/>
+      <w:lvlText w:val=""/>
+      <w:lvlJc w:val="left"/>
+      <w:pPr>
+        <w:tabs>
+          <w:tab w:val="num" w:pos="5040"/>
+        </w:tabs>
+        <w:ind w:left="5040" w:hanging="360"/>
+      </w:pPr>
+      <w:rPr>
+        <w:rFonts w:ascii="Wingdings" w:hAnsi="Wingdings" w:hint="default"/>
+        <w:sz w:val="20"/>
+      </w:rPr>
+    </w:lvl>
+    <w:lvl w:ilvl="7" w:tentative="1">
+      <w:start w:val="1"/>
+      <w:numFmt w:val="bullet"/>
+      <w:lvlText w:val=""/>
+      <w:lvlJc w:val="left"/>
+      <w:pPr>
+        <w:tabs>
+          <w:tab w:val="num" w:pos="5760"/>
+        </w:tabs>
+        <w:ind w:left="5760" w:hanging="360"/>
+      </w:pPr>
+      <w:rPr>
+        <w:rFonts w:ascii="Wingdings" w:hAnsi="Wingdings" w:hint="default"/>
+        <w:sz w:val="20"/>
+      </w:rPr>
+    </w:lvl>
+    <w:lvl w:ilvl="8" w:tentative="1">
+      <w:start w:val="1"/>
+      <w:numFmt w:val="bullet"/>
+      <w:lvlText w:val=""/>
+      <w:lvlJc w:val="left"/>
+      <w:pPr>
+        <w:tabs>
+          <w:tab w:val="num" w:pos="6480"/>
+        </w:tabs>
+        <w:ind w:left="6480" w:hanging="360"/>
+      </w:pPr>
+      <w:rPr>
+        <w:rFonts w:ascii="Wingdings" w:hAnsi="Wingdings" w:hint="default"/>
+        <w:sz w:val="20"/>
+      </w:rPr>
+    </w:lvl>
+  </w:abstractNum>
+  <w:abstractNum w:abstractNumId="9" w15:restartNumberingAfterBreak="0">
+    <w:nsid w:val="79EA5C34"/>
+    <w:multiLevelType w:val="multilevel"/>
+    <w:tmpl w:val="0C4659EC"/>
+    <w:lvl w:ilvl="0">
+      <w:start w:val="1"/>
+      <w:numFmt w:val="bullet"/>
+      <w:lvlText w:val=""/>
+      <w:lvlJc w:val="left"/>
+      <w:pPr>
+        <w:tabs>
+          <w:tab w:val="num" w:pos="720"/>
+        </w:tabs>
+        <w:ind w:left="720" w:hanging="360"/>
+      </w:pPr>
+      <w:rPr>
+        <w:rFonts w:ascii="Symbol" w:hAnsi="Symbol" w:hint="default"/>
+        <w:sz w:val="20"/>
+      </w:rPr>
+    </w:lvl>
+    <w:lvl w:ilvl="1" w:tentative="1">
       <w:start w:val="1"/>
       <w:numFmt w:val="bullet"/>
       <w:lvlText w:val="o"/>
@@ -2885,10 +4782,22 @@
     <w:abstractNumId w:val="0"/>
   </w:num>
   <w:num w:numId="5" w16cid:durableId="278800762">
+    <w:abstractNumId w:val="7"/>
+  </w:num>
+  <w:num w:numId="6" w16cid:durableId="229196615">
+    <w:abstractNumId w:val="6"/>
+  </w:num>
+  <w:num w:numId="7" w16cid:durableId="1844126083">
+    <w:abstractNumId w:val="4"/>
+  </w:num>
+  <w:num w:numId="8" w16cid:durableId="1949727274">
     <w:abstractNumId w:val="5"/>
   </w:num>
-  <w:num w:numId="6" w16cid:durableId="229196615">
-    <w:abstractNumId w:val="4"/>
+  <w:num w:numId="9" w16cid:durableId="249702124">
+    <w:abstractNumId w:val="9"/>
+  </w:num>
+  <w:num w:numId="10" w16cid:durableId="1890846692">
+    <w:abstractNumId w:val="8"/>
   </w:num>
 </w:numbering>
 </file>

</xml_diff>